<commit_message>
Adapt Qalam project to 28 pages and Zerde 2026 document templates
</commit_message>
<xml_diff>
--- a/web/downloads/Qalam-project-package/02-Qalam-AI-declaration.docx
+++ b/web/downloads/Qalam-project-package/02-Qalam-AI-declaration.docx
@@ -4,26 +4,55 @@
   <w:body>
     <w:p>
       <w:pPr>
-        <w:pStyle w:val="Title"/>
+        <w:jc w:val="right"/>
       </w:pPr>
       <w:r>
-        <w:t>ЖАСАНДЫ ИНТЕЛЛЕКТІ ҚОЛДАНУ ТУРАЛЫ ДЕКЛАРАЦИЯ</w:t>
+        <w:t>4-қосымша</w:t>
+      </w:r>
+    </w:p>
+    <w:p>
+      <w:pPr>
+        <w:jc w:val="center"/>
+      </w:pPr>
+      <w:r>
+        <w:rPr>
+          <w:b/>
+        </w:rPr>
+        <w:t>Жасанды интеллектіні пайдалану туралы декларация</w:t>
       </w:r>
     </w:p>
     <w:p>
       <w:r>
-        <w:t>Жоба: «Онлайн кітапхана: кітапхана жұмысын цифрландыру»</w:t>
-        <w:br/>
-        <w:t>Авторлар: Амантай Елжан Ерланұлы, Мұхаметкәрім Айбын Таңатұлы</w:t>
-        <w:br/>
-        <w:t>Сынып: 7</w:t>
-        <w:br/>
-        <w:t>Ғылыми жетекші: Мұхаметкәрім Қаныш Саятұлы</w:t>
+        <w:t>Тіркеу коды (шифры): ____________________</w:t>
       </w:r>
     </w:p>
     <w:p>
       <w:r>
-        <w:t>ЖИ қолданылды. Бұл мәтін нақты қолдану сипатын көрсету үшін дайындалды. Модельдің дәл нұсқасы мен жеке жұмыс кезеңдері логпен және авторлармен нақтыланады.</w:t>
+        <w:t>Бағыты: жаратылыстану-математикалық</w:t>
+      </w:r>
+    </w:p>
+    <w:p>
+      <w:r>
+        <w:t>Секция атауы: Информатика, жасанды интеллект, робототехника және STEM-инженерия</w:t>
+      </w:r>
+    </w:p>
+    <w:p>
+      <w:r>
+        <w:t>Жоба тақырыбы: «Онлайн кітапхана: кітапхана жұмысын цифрландыру»</w:t>
+      </w:r>
+    </w:p>
+    <w:p>
+      <w:r>
+        <w:t>ЖИ пайдалану мәртебесі:</w:t>
+        <w:br/>
+        <w:t>□ Жасанды интеллект пайдаланылған жоқ.</w:t>
+        <w:br/>
+        <w:t>☑ Жасанды интеллект пайдаланылды.</w:t>
+      </w:r>
+    </w:p>
+    <w:p>
+      <w:r>
+        <w:t>Қолдану жағдайы: Сайт коды</w:t>
       </w:r>
     </w:p>
     <w:tbl>
@@ -33,47 +62,65 @@
         <w:tblLook w:firstColumn="1" w:firstRow="1" w:lastColumn="0" w:lastRow="0" w:noHBand="0" w:noVBand="1" w:val="04A0"/>
       </w:tblPr>
       <w:tblGrid>
-        <w:gridCol w:w="4677"/>
-        <w:gridCol w:w="4677"/>
+        <w:gridCol w:w="3024"/>
+        <w:gridCol w:w="3024"/>
+        <w:gridCol w:w="3024"/>
       </w:tblGrid>
       <w:tr>
         <w:trPr>
-          <w:tblHeader/>
           <w:cantSplit/>
         </w:trPr>
         <w:tc>
           <w:tcPr>
-            <w:tcW w:type="dxa" w:w="4677"/>
-            <w:shd w:fill="E8EEDF"/>
+            <w:tcW w:type="dxa" w:w="3024"/>
           </w:tcPr>
           <w:p>
             <w:pPr>
-              <w:spacing w:after="60" w:before="60" w:line="252" w:lineRule="auto"/>
+              <w:spacing w:line="240" w:lineRule="auto" w:after="60"/>
             </w:pPr>
             <w:r>
               <w:rPr>
+                <w:rFonts w:ascii="Times New Roman" w:hAnsi="Times New Roman"/>
                 <w:b/>
                 <w:sz w:val="22"/>
               </w:rPr>
-              <w:t>Сұрақ</w:t>
+              <w:t>№</w:t>
             </w:r>
           </w:p>
         </w:tc>
         <w:tc>
           <w:tcPr>
-            <w:tcW w:type="dxa" w:w="4677"/>
-            <w:shd w:fill="E8EEDF"/>
+            <w:tcW w:type="dxa" w:w="3024"/>
           </w:tcPr>
           <w:p>
             <w:pPr>
-              <w:spacing w:after="60" w:before="60" w:line="252" w:lineRule="auto"/>
+              <w:spacing w:line="240" w:lineRule="auto" w:after="60"/>
             </w:pPr>
             <w:r>
               <w:rPr>
+                <w:rFonts w:ascii="Times New Roman" w:hAnsi="Times New Roman"/>
                 <w:b/>
                 <w:sz w:val="22"/>
               </w:rPr>
-              <w:t>Qalam бойынша мәлімет</w:t>
+              <w:t>Сұралатын мәліметтер</w:t>
+            </w:r>
+          </w:p>
+        </w:tc>
+        <w:tc>
+          <w:tcPr>
+            <w:tcW w:type="dxa" w:w="3024"/>
+          </w:tcPr>
+          <w:p>
+            <w:pPr>
+              <w:spacing w:line="240" w:lineRule="auto" w:after="60"/>
+            </w:pPr>
+            <w:r>
+              <w:rPr>
+                <w:rFonts w:ascii="Times New Roman" w:hAnsi="Times New Roman"/>
+                <w:b/>
+                <w:sz w:val="22"/>
+              </w:rPr>
+              <w:t>ЖИ пайдаланылуы туралы мәліметтер</w:t>
             </w:r>
           </w:p>
         </w:tc>
@@ -84,35 +131,55 @@
         </w:trPr>
         <w:tc>
           <w:tcPr>
-            <w:tcW w:type="dxa" w:w="4677"/>
+            <w:tcW w:type="dxa" w:w="3024"/>
           </w:tcPr>
           <w:p>
             <w:pPr>
-              <w:spacing w:after="60" w:before="60" w:line="252" w:lineRule="auto"/>
+              <w:spacing w:line="240" w:lineRule="auto" w:after="60"/>
             </w:pPr>
             <w:r>
               <w:rPr>
+                <w:rFonts w:ascii="Times New Roman" w:hAnsi="Times New Roman"/>
                 <w:b w:val="0"/>
                 <w:sz w:val="22"/>
               </w:rPr>
-              <w:t>Құрал</w:t>
+              <w:t>1</w:t>
             </w:r>
           </w:p>
         </w:tc>
         <w:tc>
           <w:tcPr>
-            <w:tcW w:type="dxa" w:w="4677"/>
+            <w:tcW w:type="dxa" w:w="3024"/>
           </w:tcPr>
           <w:p>
             <w:pPr>
-              <w:spacing w:after="60" w:before="60" w:line="252" w:lineRule="auto"/>
+              <w:spacing w:line="240" w:lineRule="auto" w:after="60"/>
             </w:pPr>
             <w:r>
               <w:rPr>
+                <w:rFonts w:ascii="Times New Roman" w:hAnsi="Times New Roman"/>
                 <w:b w:val="0"/>
                 <w:sz w:val="22"/>
               </w:rPr>
-              <w:t>OpenAI ChatGPT/Codex. Модель/нұсқа: ____________________.</w:t>
+              <w:t>ЖИ құралының атауы және нұсқасы (егер нұсқасы белгілі болса)</w:t>
+            </w:r>
+          </w:p>
+        </w:tc>
+        <w:tc>
+          <w:tcPr>
+            <w:tcW w:type="dxa" w:w="3024"/>
+          </w:tcPr>
+          <w:p>
+            <w:pPr>
+              <w:spacing w:line="240" w:lineRule="auto" w:after="60"/>
+            </w:pPr>
+            <w:r>
+              <w:rPr>
+                <w:rFonts w:ascii="Times New Roman" w:hAnsi="Times New Roman"/>
+                <w:b w:val="0"/>
+                <w:sz w:val="22"/>
+              </w:rPr>
+              <w:t>OpenAI ChatGPT/Codex. Нақты модель нұсқасы: __________.</w:t>
             </w:r>
           </w:p>
         </w:tc>
@@ -123,35 +190,55 @@
         </w:trPr>
         <w:tc>
           <w:tcPr>
-            <w:tcW w:type="dxa" w:w="4677"/>
+            <w:tcW w:type="dxa" w:w="3024"/>
           </w:tcPr>
           <w:p>
             <w:pPr>
-              <w:spacing w:after="60" w:before="60" w:line="252" w:lineRule="auto"/>
+              <w:spacing w:line="240" w:lineRule="auto" w:after="60"/>
             </w:pPr>
             <w:r>
               <w:rPr>
+                <w:rFonts w:ascii="Times New Roman" w:hAnsi="Times New Roman"/>
                 <w:b w:val="0"/>
                 <w:sz w:val="22"/>
               </w:rPr>
-              <w:t>Қолдану мақсаты</w:t>
+              <w:t>2</w:t>
             </w:r>
           </w:p>
         </w:tc>
         <w:tc>
           <w:tcPr>
-            <w:tcW w:type="dxa" w:w="4677"/>
+            <w:tcW w:type="dxa" w:w="3024"/>
           </w:tcPr>
           <w:p>
             <w:pPr>
-              <w:spacing w:after="60" w:before="60" w:line="252" w:lineRule="auto"/>
+              <w:spacing w:line="240" w:lineRule="auto" w:after="60"/>
             </w:pPr>
             <w:r>
               <w:rPr>
+                <w:rFonts w:ascii="Times New Roman" w:hAnsi="Times New Roman"/>
                 <w:b w:val="0"/>
                 <w:sz w:val="22"/>
               </w:rPr>
-              <w:t>Сайт кодының елеулі бөлігін әзірлеу және түзету; сервер, аккаунт, брондау, пікір, рейтинг, қор есебі; мәтін, құжат және дизайн дайындау.</w:t>
+              <w:t>Жобамен жұмыс істеу кезеңі және ЖИ пайдалану мақсаты</w:t>
+            </w:r>
+          </w:p>
+        </w:tc>
+        <w:tc>
+          <w:tcPr>
+            <w:tcW w:type="dxa" w:w="3024"/>
+          </w:tcPr>
+          <w:p>
+            <w:pPr>
+              <w:spacing w:line="240" w:lineRule="auto" w:after="60"/>
+            </w:pPr>
+            <w:r>
+              <w:rPr>
+                <w:rFonts w:ascii="Times New Roman" w:hAnsi="Times New Roman"/>
+                <w:b w:val="0"/>
+                <w:sz w:val="22"/>
+              </w:rPr>
+              <w:t>Сайттың елеулі кодын жасау және түзету.</w:t>
             </w:r>
           </w:p>
         </w:tc>
@@ -162,35 +249,55 @@
         </w:trPr>
         <w:tc>
           <w:tcPr>
-            <w:tcW w:type="dxa" w:w="4677"/>
+            <w:tcW w:type="dxa" w:w="3024"/>
           </w:tcPr>
           <w:p>
             <w:pPr>
-              <w:spacing w:after="60" w:before="60" w:line="252" w:lineRule="auto"/>
+              <w:spacing w:line="240" w:lineRule="auto" w:after="60"/>
             </w:pPr>
             <w:r>
               <w:rPr>
+                <w:rFonts w:ascii="Times New Roman" w:hAnsi="Times New Roman"/>
                 <w:b w:val="0"/>
                 <w:sz w:val="22"/>
               </w:rPr>
-              <w:t>Сұраныс мысалы</w:t>
+              <w:t>3</w:t>
             </w:r>
           </w:p>
         </w:tc>
         <w:tc>
           <w:tcPr>
-            <w:tcW w:type="dxa" w:w="4677"/>
+            <w:tcW w:type="dxa" w:w="3024"/>
           </w:tcPr>
           <w:p>
             <w:pPr>
-              <w:spacing w:after="60" w:before="60" w:line="252" w:lineRule="auto"/>
+              <w:spacing w:line="240" w:lineRule="auto" w:after="60"/>
             </w:pPr>
             <w:r>
               <w:rPr>
+                <w:rFonts w:ascii="Times New Roman" w:hAnsi="Times New Roman"/>
                 <w:b w:val="0"/>
                 <w:sz w:val="22"/>
               </w:rPr>
-              <w:t>Кітапхана сайтын жасау; әкімші қосу; ортақ пікір мен баға сақтау; дана санын көрсету; кітап тарихы, ұсыныс және сауалнама қосу; қорғау сөзін жеңілдету.</w:t>
+              <w:t>Негізгі сұраулардың қысқаша мазмұны</w:t>
+            </w:r>
+          </w:p>
+        </w:tc>
+        <w:tc>
+          <w:tcPr>
+            <w:tcW w:type="dxa" w:w="3024"/>
+          </w:tcPr>
+          <w:p>
+            <w:pPr>
+              <w:spacing w:line="240" w:lineRule="auto" w:after="60"/>
+            </w:pPr>
+            <w:r>
+              <w:rPr>
+                <w:rFonts w:ascii="Times New Roman" w:hAnsi="Times New Roman"/>
+                <w:b w:val="0"/>
+                <w:sz w:val="22"/>
+              </w:rPr>
+              <w:t>Кітапхана сайты, аккаунт, брондау, пікір, қор және рейтинг қосу.</w:t>
             </w:r>
           </w:p>
         </w:tc>
@@ -201,35 +308,55 @@
         </w:trPr>
         <w:tc>
           <w:tcPr>
-            <w:tcW w:type="dxa" w:w="4677"/>
+            <w:tcW w:type="dxa" w:w="3024"/>
           </w:tcPr>
           <w:p>
             <w:pPr>
-              <w:spacing w:after="60" w:before="60" w:line="252" w:lineRule="auto"/>
+              <w:spacing w:line="240" w:lineRule="auto" w:after="60"/>
             </w:pPr>
             <w:r>
               <w:rPr>
+                <w:rFonts w:ascii="Times New Roman" w:hAnsi="Times New Roman"/>
                 <w:b w:val="0"/>
                 <w:sz w:val="22"/>
               </w:rPr>
-              <w:t>Қолданылған нәтиже</w:t>
+              <w:t>4</w:t>
             </w:r>
           </w:p>
         </w:tc>
         <w:tc>
           <w:tcPr>
-            <w:tcW w:type="dxa" w:w="4677"/>
+            <w:tcW w:type="dxa" w:w="3024"/>
           </w:tcPr>
           <w:p>
             <w:pPr>
-              <w:spacing w:after="60" w:before="60" w:line="252" w:lineRule="auto"/>
+              <w:spacing w:line="240" w:lineRule="auto" w:after="60"/>
             </w:pPr>
             <w:r>
               <w:rPr>
+                <w:rFonts w:ascii="Times New Roman" w:hAnsi="Times New Roman"/>
                 <w:b w:val="0"/>
                 <w:sz w:val="22"/>
               </w:rPr>
-              <w:t>Код, түсіндірме, құжаттардың жобасы, интерфейс және логотип нұсқасы.</w:t>
+              <w:t>ЖИ-ге берілген негізгі сұраулардың қысқаша мазмұны; нәтиже қолданылған бөлік</w:t>
+            </w:r>
+          </w:p>
+        </w:tc>
+        <w:tc>
+          <w:tcPr>
+            <w:tcW w:type="dxa" w:w="3024"/>
+          </w:tcPr>
+          <w:p>
+            <w:pPr>
+              <w:spacing w:line="240" w:lineRule="auto" w:after="60"/>
+            </w:pPr>
+            <w:r>
+              <w:rPr>
+                <w:rFonts w:ascii="Times New Roman" w:hAnsi="Times New Roman"/>
+                <w:b w:val="0"/>
+                <w:sz w:val="22"/>
+              </w:rPr>
+              <w:t>web/server.js, accounts.js, library-server.js және өзге сайт файлдары. Нақты үлесті жұмыс журналымен көрсету қажет.</w:t>
             </w:r>
           </w:p>
         </w:tc>
@@ -240,35 +367,55 @@
         </w:trPr>
         <w:tc>
           <w:tcPr>
-            <w:tcW w:type="dxa" w:w="4677"/>
+            <w:tcW w:type="dxa" w:w="3024"/>
           </w:tcPr>
           <w:p>
             <w:pPr>
-              <w:spacing w:after="60" w:before="60" w:line="252" w:lineRule="auto"/>
+              <w:spacing w:line="240" w:lineRule="auto" w:after="60"/>
             </w:pPr>
             <w:r>
               <w:rPr>
+                <w:rFonts w:ascii="Times New Roman" w:hAnsi="Times New Roman"/>
                 <w:b w:val="0"/>
                 <w:sz w:val="22"/>
               </w:rPr>
-              <w:t>Тексеру</w:t>
+              <w:t>5</w:t>
             </w:r>
           </w:p>
         </w:tc>
         <w:tc>
           <w:tcPr>
-            <w:tcW w:type="dxa" w:w="4677"/>
+            <w:tcW w:type="dxa" w:w="3024"/>
           </w:tcPr>
           <w:p>
             <w:pPr>
-              <w:spacing w:after="60" w:before="60" w:line="252" w:lineRule="auto"/>
+              <w:spacing w:line="240" w:lineRule="auto" w:after="60"/>
             </w:pPr>
             <w:r>
               <w:rPr>
+                <w:rFonts w:ascii="Times New Roman" w:hAnsi="Times New Roman"/>
                 <w:b w:val="0"/>
                 <w:sz w:val="22"/>
               </w:rPr>
-              <w:t>Код пен рұқсаттарды қарау, алты автоматты тест, браузер сценарийлері және PDF/DOCX мәтінін тексеру.</w:t>
+              <w:t>Алынған нәтиженің дұрыстығы мен нақтылығын тексеру тәсілдері</w:t>
+            </w:r>
+          </w:p>
+        </w:tc>
+        <w:tc>
+          <w:tcPr>
+            <w:tcW w:type="dxa" w:w="3024"/>
+          </w:tcPr>
+          <w:p>
+            <w:pPr>
+              <w:spacing w:line="240" w:lineRule="auto" w:after="60"/>
+            </w:pPr>
+            <w:r>
+              <w:rPr>
+                <w:rFonts w:ascii="Times New Roman" w:hAnsi="Times New Roman"/>
+                <w:b w:val="0"/>
+                <w:sz w:val="22"/>
+              </w:rPr>
+              <w:t>Алты автоматты тест өтті; браузер сценарийлері тексерілді. Бұл тексерулер ассистент арқылы орындалды.</w:t>
             </w:r>
           </w:p>
         </w:tc>
@@ -279,35 +426,131 @@
         </w:trPr>
         <w:tc>
           <w:tcPr>
-            <w:tcW w:type="dxa" w:w="4677"/>
+            <w:tcW w:type="dxa" w:w="3024"/>
           </w:tcPr>
           <w:p>
             <w:pPr>
-              <w:spacing w:after="60" w:before="60" w:line="252" w:lineRule="auto"/>
+              <w:spacing w:line="240" w:lineRule="auto" w:after="60"/>
             </w:pPr>
             <w:r>
               <w:rPr>
+                <w:rFonts w:ascii="Times New Roman" w:hAnsi="Times New Roman"/>
                 <w:b w:val="0"/>
                 <w:sz w:val="22"/>
               </w:rPr>
-              <w:t>Авторлардың үлесі</w:t>
+              <w:t>6</w:t>
             </w:r>
           </w:p>
         </w:tc>
         <w:tc>
           <w:tcPr>
-            <w:tcW w:type="dxa" w:w="4677"/>
+            <w:tcW w:type="dxa" w:w="3024"/>
           </w:tcPr>
           <w:p>
             <w:pPr>
-              <w:spacing w:after="60" w:before="60" w:line="252" w:lineRule="auto"/>
+              <w:spacing w:line="240" w:lineRule="auto" w:after="60"/>
             </w:pPr>
             <w:r>
               <w:rPr>
+                <w:rFonts w:ascii="Times New Roman" w:hAnsi="Times New Roman"/>
                 <w:b w:val="0"/>
                 <w:sz w:val="22"/>
               </w:rPr>
-              <w:t>Нақты әрекеттер 8-құжатта авторлар мен жетекші арқылы расталады; кодтың бәрін оқушылар өздері жазды деп көрсетілмейді.</w:t>
+              <w:t>Автордың (авторлардың) алынған нәтижеге өз бетінше енгізген өзгерістері мен толықтырулары</w:t>
+            </w:r>
+          </w:p>
+        </w:tc>
+        <w:tc>
+          <w:tcPr>
+            <w:tcW w:type="dxa" w:w="3024"/>
+          </w:tcPr>
+          <w:p>
+            <w:pPr>
+              <w:spacing w:line="240" w:lineRule="auto" w:after="60"/>
+            </w:pPr>
+            <w:r>
+              <w:rPr>
+                <w:rFonts w:ascii="Times New Roman" w:hAnsi="Times New Roman"/>
+                <w:b w:val="0"/>
+                <w:sz w:val="22"/>
+              </w:rPr>
+              <w:t>Оқушылардың жеке түзетулері туралы расталған жазба жоқ. Нақты әрекет пен дәлел: __________.</w:t>
+            </w:r>
+          </w:p>
+        </w:tc>
+      </w:tr>
+    </w:tbl>
+    <w:p>
+      <w:r>
+        <w:t>Қолдану жағдайы: Құжаттар мен дизайн</w:t>
+      </w:r>
+    </w:p>
+    <w:tbl>
+      <w:tblPr>
+        <w:tblStyle w:val="TableGrid"/>
+        <w:tblW w:type="auto" w:w="0"/>
+        <w:tblLook w:firstColumn="1" w:firstRow="1" w:lastColumn="0" w:lastRow="0" w:noHBand="0" w:noVBand="1" w:val="04A0"/>
+      </w:tblPr>
+      <w:tblGrid>
+        <w:gridCol w:w="3024"/>
+        <w:gridCol w:w="3024"/>
+        <w:gridCol w:w="3024"/>
+      </w:tblGrid>
+      <w:tr>
+        <w:trPr>
+          <w:cantSplit/>
+        </w:trPr>
+        <w:tc>
+          <w:tcPr>
+            <w:tcW w:type="dxa" w:w="3024"/>
+          </w:tcPr>
+          <w:p>
+            <w:pPr>
+              <w:spacing w:line="240" w:lineRule="auto" w:after="60"/>
+            </w:pPr>
+            <w:r>
+              <w:rPr>
+                <w:rFonts w:ascii="Times New Roman" w:hAnsi="Times New Roman"/>
+                <w:b/>
+                <w:sz w:val="22"/>
+              </w:rPr>
+              <w:t>№</w:t>
+            </w:r>
+          </w:p>
+        </w:tc>
+        <w:tc>
+          <w:tcPr>
+            <w:tcW w:type="dxa" w:w="3024"/>
+          </w:tcPr>
+          <w:p>
+            <w:pPr>
+              <w:spacing w:line="240" w:lineRule="auto" w:after="60"/>
+            </w:pPr>
+            <w:r>
+              <w:rPr>
+                <w:rFonts w:ascii="Times New Roman" w:hAnsi="Times New Roman"/>
+                <w:b/>
+                <w:sz w:val="22"/>
+              </w:rPr>
+              <w:t>Сұралатын мәліметтер</w:t>
+            </w:r>
+          </w:p>
+        </w:tc>
+        <w:tc>
+          <w:tcPr>
+            <w:tcW w:type="dxa" w:w="3024"/>
+          </w:tcPr>
+          <w:p>
+            <w:pPr>
+              <w:spacing w:line="240" w:lineRule="auto" w:after="60"/>
+            </w:pPr>
+            <w:r>
+              <w:rPr>
+                <w:rFonts w:ascii="Times New Roman" w:hAnsi="Times New Roman"/>
+                <w:b/>
+                <w:sz w:val="22"/>
+              </w:rPr>
+              <w:t>ЖИ пайдаланылуы туралы мәліметтер</w:t>
             </w:r>
           </w:p>
         </w:tc>
@@ -318,108 +561,379 @@
         </w:trPr>
         <w:tc>
           <w:tcPr>
-            <w:tcW w:type="dxa" w:w="4677"/>
+            <w:tcW w:type="dxa" w:w="3024"/>
           </w:tcPr>
           <w:p>
             <w:pPr>
-              <w:spacing w:after="60" w:before="60" w:line="252" w:lineRule="auto"/>
+              <w:spacing w:line="240" w:lineRule="auto" w:after="60"/>
             </w:pPr>
             <w:r>
               <w:rPr>
+                <w:rFonts w:ascii="Times New Roman" w:hAnsi="Times New Roman"/>
                 <w:b w:val="0"/>
                 <w:sz w:val="22"/>
               </w:rPr>
-              <w:t>Зерттеу дерегі</w:t>
+              <w:t>1</w:t>
             </w:r>
           </w:p>
         </w:tc>
         <w:tc>
           <w:tcPr>
-            <w:tcW w:type="dxa" w:w="4677"/>
+            <w:tcW w:type="dxa" w:w="3024"/>
           </w:tcPr>
           <w:p>
             <w:pPr>
-              <w:spacing w:after="60" w:before="60" w:line="252" w:lineRule="auto"/>
+              <w:spacing w:line="240" w:lineRule="auto" w:after="60"/>
             </w:pPr>
             <w:r>
               <w:rPr>
+                <w:rFonts w:ascii="Times New Roman" w:hAnsi="Times New Roman"/>
                 <w:b w:val="0"/>
                 <w:sz w:val="22"/>
               </w:rPr>
-              <w:t>ЖИ нақты сауалнама нәтижесін не оқушы жауабын жасау үшін қолданылған жоқ. Сыныптық сынақ кестелері әзірге бос.</w:t>
+              <w:t>ЖИ құралының атауы және нұсқасы (егер нұсқасы белгілі болса)</w:t>
+            </w:r>
+          </w:p>
+        </w:tc>
+        <w:tc>
+          <w:tcPr>
+            <w:tcW w:type="dxa" w:w="3024"/>
+          </w:tcPr>
+          <w:p>
+            <w:pPr>
+              <w:spacing w:line="240" w:lineRule="auto" w:after="60"/>
+            </w:pPr>
+            <w:r>
+              <w:rPr>
+                <w:rFonts w:ascii="Times New Roman" w:hAnsi="Times New Roman"/>
+                <w:b w:val="0"/>
+                <w:sz w:val="22"/>
+              </w:rPr>
+              <w:t>OpenAI ChatGPT/Codex. Нақты модель нұсқасы: __________.</w:t>
+            </w:r>
+          </w:p>
+        </w:tc>
+      </w:tr>
+      <w:tr>
+        <w:trPr>
+          <w:cantSplit/>
+        </w:trPr>
+        <w:tc>
+          <w:tcPr>
+            <w:tcW w:type="dxa" w:w="3024"/>
+          </w:tcPr>
+          <w:p>
+            <w:pPr>
+              <w:spacing w:line="240" w:lineRule="auto" w:after="60"/>
+            </w:pPr>
+            <w:r>
+              <w:rPr>
+                <w:rFonts w:ascii="Times New Roman" w:hAnsi="Times New Roman"/>
+                <w:b w:val="0"/>
+                <w:sz w:val="22"/>
+              </w:rPr>
+              <w:t>2</w:t>
+            </w:r>
+          </w:p>
+        </w:tc>
+        <w:tc>
+          <w:tcPr>
+            <w:tcW w:type="dxa" w:w="3024"/>
+          </w:tcPr>
+          <w:p>
+            <w:pPr>
+              <w:spacing w:line="240" w:lineRule="auto" w:after="60"/>
+            </w:pPr>
+            <w:r>
+              <w:rPr>
+                <w:rFonts w:ascii="Times New Roman" w:hAnsi="Times New Roman"/>
+                <w:b w:val="0"/>
+                <w:sz w:val="22"/>
+              </w:rPr>
+              <w:t>Жобамен жұмыс істеу кезеңі және ЖИ пайдалану мақсаты</w:t>
+            </w:r>
+          </w:p>
+        </w:tc>
+        <w:tc>
+          <w:tcPr>
+            <w:tcW w:type="dxa" w:w="3024"/>
+          </w:tcPr>
+          <w:p>
+            <w:pPr>
+              <w:spacing w:line="240" w:lineRule="auto" w:after="60"/>
+            </w:pPr>
+            <w:r>
+              <w:rPr>
+                <w:rFonts w:ascii="Times New Roman" w:hAnsi="Times New Roman"/>
+                <w:b w:val="0"/>
+                <w:sz w:val="22"/>
+              </w:rPr>
+              <w:t>Ғылыми мәтін, қорғау сөзі, нұсқаулық, презентация, безендіру.</w:t>
+            </w:r>
+          </w:p>
+        </w:tc>
+      </w:tr>
+      <w:tr>
+        <w:trPr>
+          <w:cantSplit/>
+        </w:trPr>
+        <w:tc>
+          <w:tcPr>
+            <w:tcW w:type="dxa" w:w="3024"/>
+          </w:tcPr>
+          <w:p>
+            <w:pPr>
+              <w:spacing w:line="240" w:lineRule="auto" w:after="60"/>
+            </w:pPr>
+            <w:r>
+              <w:rPr>
+                <w:rFonts w:ascii="Times New Roman" w:hAnsi="Times New Roman"/>
+                <w:b w:val="0"/>
+                <w:sz w:val="22"/>
+              </w:rPr>
+              <w:t>3</w:t>
+            </w:r>
+          </w:p>
+        </w:tc>
+        <w:tc>
+          <w:tcPr>
+            <w:tcW w:type="dxa" w:w="3024"/>
+          </w:tcPr>
+          <w:p>
+            <w:pPr>
+              <w:spacing w:line="240" w:lineRule="auto" w:after="60"/>
+            </w:pPr>
+            <w:r>
+              <w:rPr>
+                <w:rFonts w:ascii="Times New Roman" w:hAnsi="Times New Roman"/>
+                <w:b w:val="0"/>
+                <w:sz w:val="22"/>
+              </w:rPr>
+              <w:t>Негізгі сұраулардың қысқаша мазмұны</w:t>
+            </w:r>
+          </w:p>
+        </w:tc>
+        <w:tc>
+          <w:tcPr>
+            <w:tcW w:type="dxa" w:w="3024"/>
+          </w:tcPr>
+          <w:p>
+            <w:pPr>
+              <w:spacing w:line="240" w:lineRule="auto" w:after="60"/>
+            </w:pPr>
+            <w:r>
+              <w:rPr>
+                <w:rFonts w:ascii="Times New Roman" w:hAnsi="Times New Roman"/>
+                <w:b w:val="0"/>
+                <w:sz w:val="22"/>
+              </w:rPr>
+              <w:t>Үлгіге бейімдеу, мәтінді жеңілдету, 28 бет және 190 сөздік аннотация дайындау.</w:t>
+            </w:r>
+          </w:p>
+        </w:tc>
+      </w:tr>
+      <w:tr>
+        <w:trPr>
+          <w:cantSplit/>
+        </w:trPr>
+        <w:tc>
+          <w:tcPr>
+            <w:tcW w:type="dxa" w:w="3024"/>
+          </w:tcPr>
+          <w:p>
+            <w:pPr>
+              <w:spacing w:line="240" w:lineRule="auto" w:after="60"/>
+            </w:pPr>
+            <w:r>
+              <w:rPr>
+                <w:rFonts w:ascii="Times New Roman" w:hAnsi="Times New Roman"/>
+                <w:b w:val="0"/>
+                <w:sz w:val="22"/>
+              </w:rPr>
+              <w:t>4</w:t>
+            </w:r>
+          </w:p>
+        </w:tc>
+        <w:tc>
+          <w:tcPr>
+            <w:tcW w:type="dxa" w:w="3024"/>
+          </w:tcPr>
+          <w:p>
+            <w:pPr>
+              <w:spacing w:line="240" w:lineRule="auto" w:after="60"/>
+            </w:pPr>
+            <w:r>
+              <w:rPr>
+                <w:rFonts w:ascii="Times New Roman" w:hAnsi="Times New Roman"/>
+                <w:b w:val="0"/>
+                <w:sz w:val="22"/>
+              </w:rPr>
+              <w:t>ЖИ-ге берілген негізгі сұраулардың қысқаша мазмұны; нәтиже қолданылған бөлік</w:t>
+            </w:r>
+          </w:p>
+        </w:tc>
+        <w:tc>
+          <w:tcPr>
+            <w:tcW w:type="dxa" w:w="3024"/>
+          </w:tcPr>
+          <w:p>
+            <w:pPr>
+              <w:spacing w:line="240" w:lineRule="auto" w:after="60"/>
+            </w:pPr>
+            <w:r>
+              <w:rPr>
+                <w:rFonts w:ascii="Times New Roman" w:hAnsi="Times New Roman"/>
+                <w:b w:val="0"/>
+                <w:sz w:val="22"/>
+              </w:rPr>
+              <w:t>28 беттік жұмыстың мәтіні; қосымша құжаттар; 16 слайд; сайттағы таныстыру және логотип нұсқасы.</w:t>
+            </w:r>
+          </w:p>
+        </w:tc>
+      </w:tr>
+      <w:tr>
+        <w:trPr>
+          <w:cantSplit/>
+        </w:trPr>
+        <w:tc>
+          <w:tcPr>
+            <w:tcW w:type="dxa" w:w="3024"/>
+          </w:tcPr>
+          <w:p>
+            <w:pPr>
+              <w:spacing w:line="240" w:lineRule="auto" w:after="60"/>
+            </w:pPr>
+            <w:r>
+              <w:rPr>
+                <w:rFonts w:ascii="Times New Roman" w:hAnsi="Times New Roman"/>
+                <w:b w:val="0"/>
+                <w:sz w:val="22"/>
+              </w:rPr>
+              <w:t>5</w:t>
+            </w:r>
+          </w:p>
+        </w:tc>
+        <w:tc>
+          <w:tcPr>
+            <w:tcW w:type="dxa" w:w="3024"/>
+          </w:tcPr>
+          <w:p>
+            <w:pPr>
+              <w:spacing w:line="240" w:lineRule="auto" w:after="60"/>
+            </w:pPr>
+            <w:r>
+              <w:rPr>
+                <w:rFonts w:ascii="Times New Roman" w:hAnsi="Times New Roman"/>
+                <w:b w:val="0"/>
+                <w:sz w:val="22"/>
+              </w:rPr>
+              <w:t>Алынған нәтиженің дұрыстығы мен нақтылығын тексеру тәсілдері</w:t>
+            </w:r>
+          </w:p>
+        </w:tc>
+        <w:tc>
+          <w:tcPr>
+            <w:tcW w:type="dxa" w:w="3024"/>
+          </w:tcPr>
+          <w:p>
+            <w:pPr>
+              <w:spacing w:line="240" w:lineRule="auto" w:after="60"/>
+            </w:pPr>
+            <w:r>
+              <w:rPr>
+                <w:rFonts w:ascii="Times New Roman" w:hAnsi="Times New Roman"/>
+                <w:b w:val="0"/>
+                <w:sz w:val="22"/>
+              </w:rPr>
+              <w:t>Бет саны, сөз саны, формат және файлдардың ашылуы тексерілді. Нақты оқушы сауалнамасы жоқ.</w:t>
+            </w:r>
+          </w:p>
+        </w:tc>
+      </w:tr>
+      <w:tr>
+        <w:trPr>
+          <w:cantSplit/>
+        </w:trPr>
+        <w:tc>
+          <w:tcPr>
+            <w:tcW w:type="dxa" w:w="3024"/>
+          </w:tcPr>
+          <w:p>
+            <w:pPr>
+              <w:spacing w:line="240" w:lineRule="auto" w:after="60"/>
+            </w:pPr>
+            <w:r>
+              <w:rPr>
+                <w:rFonts w:ascii="Times New Roman" w:hAnsi="Times New Roman"/>
+                <w:b w:val="0"/>
+                <w:sz w:val="22"/>
+              </w:rPr>
+              <w:t>6</w:t>
+            </w:r>
+          </w:p>
+        </w:tc>
+        <w:tc>
+          <w:tcPr>
+            <w:tcW w:type="dxa" w:w="3024"/>
+          </w:tcPr>
+          <w:p>
+            <w:pPr>
+              <w:spacing w:line="240" w:lineRule="auto" w:after="60"/>
+            </w:pPr>
+            <w:r>
+              <w:rPr>
+                <w:rFonts w:ascii="Times New Roman" w:hAnsi="Times New Roman"/>
+                <w:b w:val="0"/>
+                <w:sz w:val="22"/>
+              </w:rPr>
+              <w:t>Автордың (авторлардың) алынған нәтижеге өз бетінше енгізген өзгерістері мен толықтырулары</w:t>
+            </w:r>
+          </w:p>
+        </w:tc>
+        <w:tc>
+          <w:tcPr>
+            <w:tcW w:type="dxa" w:w="3024"/>
+          </w:tcPr>
+          <w:p>
+            <w:pPr>
+              <w:spacing w:line="240" w:lineRule="auto" w:after="60"/>
+            </w:pPr>
+            <w:r>
+              <w:rPr>
+                <w:rFonts w:ascii="Times New Roman" w:hAnsi="Times New Roman"/>
+                <w:b w:val="0"/>
+                <w:sz w:val="22"/>
+              </w:rPr>
+              <w:t>Нақты оқушы өңдеуі расталмаған. Өз өзгерісі: __________.</w:t>
             </w:r>
           </w:p>
         </w:tc>
       </w:tr>
     </w:tbl>
     <w:p>
-      <w:pPr>
-        <w:spacing w:after="0"/>
-      </w:pPr>
-    </w:p>
-    <w:p>
-      <w:pPr>
-        <w:pStyle w:val="Heading2"/>
-      </w:pPr>
       <w:r>
-        <w:t>Декларациялық мәлімдеме</w:t>
+        <w:t>2026 жылғы «Зерде» ережесінің 4.9–4.10-тармақтары ЖИ-ді тек қосалқы көмекке рұқсат етеді. Осы жинақтың мәтіні мен кодына ЖИ елеулі көмек көрсетті. Сондықтан бұл материал жұмыс жобасы болып табылады; оны оқушылардың толық дербес конкурстық жұмысы ретінде ұсынуға болмайды. Нақты авторлық әрекеттер мен жұмыс мәртебесін жетекші тексереді.</w:t>
       </w:r>
     </w:p>
     <w:p>
       <w:r>
-        <w:t>Құжаттағы ЖИ қолдану мәліметін авторлар мен жетекші тексеріп бекітеді. ЖИ жасаған сурет нақты зерттеу фотосы, ал тексерілмеген пікір нақты нәтиже ретінде ұсынылмайды.</w:t>
-      </w:r>
-    </w:p>
-    <w:p>
-      <w:r>
-        <w:t>Айбынның қолы: ______________</w:t>
+        <w:t>1-автордың қолы: ____________________</w:t>
         <w:br/>
-        <w:t>Елжанның қолы: ______________</w:t>
+        <w:t>2-автордың қолы: ____________________</w:t>
         <w:br/>
-        <w:t>Жетекшінің қолы: ______________</w:t>
+        <w:t>Ғылыми жетекшінің қолы: ____________________</w:t>
         <w:br/>
         <w:t>Күні: ____________________</w:t>
       </w:r>
     </w:p>
     <w:sectPr>
-      <w:headerReference w:type="default" r:id="rId9"/>
-      <w:footerReference w:type="default" r:id="rId10"/>
       <w:pgSz w:w="11906" w:h="16838"/>
-      <w:pgMar w:top="1134" w:right="1134" w:bottom="1134" w:left="1417" w:header="720" w:footer="720" w:gutter="0"/>
+      <w:pgMar w:top="1134" w:right="1134" w:bottom="1134" w:left="1701" w:header="720" w:footer="720" w:gutter="0"/>
       <w:cols w:space="720"/>
       <w:docGrid w:linePitch="360"/>
     </w:sectPr>
   </w:body>
 </w:document>
-</file>
-
-<file path=word/footer1.xml><?xml version="1.0" encoding="utf-8"?>
-<w:ftr xmlns:m="http://schemas.openxmlformats.org/officeDocument/2006/math" xmlns:mc="http://schemas.openxmlformats.org/markup-compatibility/2006" xmlns:mo="http://schemas.microsoft.com/office/mac/office/2008/main" xmlns:mv="urn:schemas-microsoft-com:mac:vml" xmlns:o="urn:schemas-microsoft-com:office:office" xmlns:r="http://schemas.openxmlformats.org/officeDocument/2006/relationships" xmlns:v="urn:schemas-microsoft-com:vml" xmlns:w10="urn:schemas-microsoft-com:office:word" xmlns:w14="http://schemas.microsoft.com/office/word/2010/wordml" xmlns:w="http://schemas.openxmlformats.org/wordprocessingml/2006/main" xmlns:wne="http://schemas.microsoft.com/office/word/2006/wordml" xmlns:wp14="http://schemas.microsoft.com/office/word/2010/wordprocessingDrawing" xmlns:wp="http://schemas.openxmlformats.org/drawingml/2006/wordprocessingDrawing" xmlns:wpc="http://schemas.microsoft.com/office/word/2010/wordprocessingCanvas" xmlns:wpg="http://schemas.microsoft.com/office/word/2010/wordprocessingGroup" xmlns:wpi="http://schemas.microsoft.com/office/word/2010/wordprocessingInk" xmlns:wps="http://schemas.microsoft.com/office/word/2010/wordprocessingShape" mc:Ignorable="w14 wp14">
-  <w:p>
-    <w:pPr>
-      <w:pStyle w:val="Footer"/>
-      <w:jc w:val="right"/>
-    </w:pPr>
-    <w:r>
-      <w:t xml:space="preserve">Qalam · </w:t>
-    </w:r>
-    <w:r/>
-    <w:fldSimple w:instr="PAGE"/>
-  </w:p>
-</w:ftr>
-</file>
-
-<file path=word/header1.xml><?xml version="1.0" encoding="utf-8"?>
-<w:hdr xmlns:m="http://schemas.openxmlformats.org/officeDocument/2006/math" xmlns:mc="http://schemas.openxmlformats.org/markup-compatibility/2006" xmlns:mo="http://schemas.microsoft.com/office/mac/office/2008/main" xmlns:mv="urn:schemas-microsoft-com:mac:vml" xmlns:o="urn:schemas-microsoft-com:office:office" xmlns:r="http://schemas.openxmlformats.org/officeDocument/2006/relationships" xmlns:v="urn:schemas-microsoft-com:vml" xmlns:w10="urn:schemas-microsoft-com:office:word" xmlns:w14="http://schemas.microsoft.com/office/word/2010/wordml" xmlns:w="http://schemas.openxmlformats.org/wordprocessingml/2006/main" xmlns:wne="http://schemas.microsoft.com/office/word/2006/wordml" xmlns:wp14="http://schemas.microsoft.com/office/word/2010/wordprocessingDrawing" xmlns:wp="http://schemas.openxmlformats.org/drawingml/2006/wordprocessingDrawing" xmlns:wpc="http://schemas.microsoft.com/office/word/2010/wordprocessingCanvas" xmlns:wpg="http://schemas.microsoft.com/office/word/2010/wordprocessingGroup" xmlns:wpi="http://schemas.microsoft.com/office/word/2010/wordprocessingInk" xmlns:wps="http://schemas.microsoft.com/office/word/2010/wordprocessingShape" mc:Ignorable="w14 wp14">
-  <w:p>
-    <w:pPr>
-      <w:pStyle w:val="Caption"/>
-    </w:pPr>
-    <w:r>
-      <w:t>QALAM · Мектеп кітапханасы</w:t>
-    </w:r>
-  </w:p>
-</w:hdr>
 </file>
 
 <file path=word/numbering.xml><?xml version="1.0" encoding="utf-8"?>
@@ -786,11 +1300,11 @@
     <w:qFormat/>
     <w:rsid w:val="00FC693F"/>
     <w:pPr>
-      <w:spacing w:line="269" w:lineRule="auto" w:after="140"/>
+      <w:spacing w:line="360" w:lineRule="auto" w:after="100"/>
     </w:pPr>
     <w:rPr>
       <w:rFonts w:ascii="Times New Roman" w:hAnsi="Times New Roman"/>
-      <w:sz w:val="24"/>
+      <w:sz w:val="28"/>
     </w:rPr>
   </w:style>
   <w:style w:type="paragraph" w:styleId="Header">
@@ -848,15 +1362,15 @@
     <w:pPr>
       <w:keepNext/>
       <w:keepLines/>
-      <w:spacing w:before="160" w:after="200"/>
+      <w:spacing w:before="480" w:after="0"/>
       <w:outlineLvl w:val="0"/>
     </w:pPr>
     <w:rPr>
-      <w:rFonts w:asciiTheme="majorHAnsi" w:eastAsiaTheme="majorEastAsia" w:hAnsiTheme="majorHAnsi" w:cstheme="majorBidi" w:ascii="Times New Roman" w:hAnsi="Times New Roman"/>
+      <w:rFonts w:asciiTheme="majorHAnsi" w:eastAsiaTheme="majorEastAsia" w:hAnsiTheme="majorHAnsi" w:cstheme="majorBidi"/>
       <w:b/>
       <w:bCs/>
-      <w:color w:val="285643"/>
-      <w:sz w:val="34"/>
+      <w:color w:val="365F91" w:themeColor="accent1" w:themeShade="BF"/>
+      <w:sz w:val="28"/>
       <w:szCs w:val="28"/>
     </w:rPr>
   </w:style>
@@ -872,15 +1386,15 @@
     <w:pPr>
       <w:keepNext/>
       <w:keepLines/>
-      <w:spacing w:before="160" w:after="200"/>
+      <w:spacing w:before="200" w:after="0"/>
       <w:outlineLvl w:val="1"/>
     </w:pPr>
     <w:rPr>
-      <w:rFonts w:asciiTheme="majorHAnsi" w:eastAsiaTheme="majorEastAsia" w:hAnsiTheme="majorHAnsi" w:cstheme="majorBidi" w:ascii="Times New Roman" w:hAnsi="Times New Roman"/>
+      <w:rFonts w:asciiTheme="majorHAnsi" w:eastAsiaTheme="majorEastAsia" w:hAnsiTheme="majorHAnsi" w:cstheme="majorBidi"/>
       <w:b/>
       <w:bCs/>
-      <w:color w:val="285643"/>
-      <w:sz w:val="28"/>
+      <w:color w:val="4F81BD" w:themeColor="accent1"/>
+      <w:sz w:val="26"/>
       <w:szCs w:val="26"/>
     </w:rPr>
   </w:style>
@@ -1137,15 +1651,15 @@
       <w:pBdr>
         <w:bottom w:val="single" w:sz="8" w:space="4" w:color="4F81BD" w:themeColor="accent1"/>
       </w:pBdr>
-      <w:spacing w:after="200" w:line="240" w:lineRule="auto" w:before="160"/>
+      <w:spacing w:after="300" w:line="240" w:lineRule="auto"/>
       <w:contextualSpacing/>
     </w:pPr>
     <w:rPr>
-      <w:rFonts w:asciiTheme="majorHAnsi" w:eastAsiaTheme="majorEastAsia" w:hAnsiTheme="majorHAnsi" w:cstheme="majorBidi" w:ascii="Times New Roman" w:hAnsi="Times New Roman"/>
-      <w:color w:val="285643"/>
+      <w:rFonts w:asciiTheme="majorHAnsi" w:eastAsiaTheme="majorEastAsia" w:hAnsiTheme="majorHAnsi" w:cstheme="majorBidi"/>
+      <w:color w:val="17365D" w:themeColor="text2" w:themeShade="BF"/>
       <w:spacing w:val="5"/>
       <w:kern w:val="28"/>
-      <w:sz w:val="48"/>
+      <w:sz w:val="52"/>
       <w:szCs w:val="52"/>
     </w:rPr>
   </w:style>

</xml_diff>